<commit_message>
add new field for notification
</commit_message>
<xml_diff>
--- a/document_templates/Notifications/Notification.docx
+++ b/document_templates/Notifications/Notification.docx
@@ -5,90 +5,42 @@
     <w:p>
       <w:pPr>
         <w:spacing w:line="240" w:lineRule="auto"/>
+        <w:ind w:left="5664" w:leftChars="0" w:firstLine="708" w:firstLineChars="0"/>
         <w:rPr>
           <w:rFonts w:hint="default" w:ascii="Times New Roman" w:hAnsi="Times New Roman" w:cs="Times New Roman"/>
           <w:color w:val="000000"/>
-          <w:sz w:val="20"/>
-          <w:szCs w:val="20"/>
-        </w:rPr>
-      </w:pPr>
+          <w:sz w:val="19"/>
+          <w:szCs w:val="19"/>
+          <w:lang w:val="en-US"/>
+        </w:rPr>
+      </w:pPr>
+      <w:bookmarkStart w:id="0" w:name="_Hlk71183188"/>
+      <w:bookmarkStart w:id="1" w:name="_Hlk66701854"/>
       <w:r>
         <w:rPr>
           <w:rFonts w:hint="default" w:ascii="Times New Roman" w:hAnsi="Times New Roman" w:cs="Times New Roman"/>
           <w:color w:val="000000"/>
-          <w:sz w:val="20"/>
-          <w:szCs w:val="20"/>
-        </w:rPr>
-        <w:t xml:space="preserve">                   </w:t>
-      </w:r>
+          <w:sz w:val="19"/>
+          <w:szCs w:val="19"/>
+        </w:rPr>
+        <w:t xml:space="preserve">Lomé, le </w:t>
+      </w:r>
+      <w:r>
+        <w:rPr>
+          <w:rFonts w:hint="default" w:ascii="Times New Roman" w:hAnsi="Times New Roman" w:cs="Times New Roman"/>
+          <w:color w:val="000000"/>
+          <w:sz w:val="19"/>
+          <w:szCs w:val="19"/>
+          <w:lang w:val="en-US"/>
+        </w:rPr>
+        <w:t>${current_date}</w:t>
+      </w:r>
+      <w:bookmarkStart w:id="2" w:name="_Hlk78960790"/>
     </w:p>
     <w:p>
       <w:pPr>
         <w:spacing w:line="240" w:lineRule="auto"/>
-        <w:rPr>
-          <w:rFonts w:hint="default" w:ascii="Times New Roman" w:hAnsi="Times New Roman" w:cs="Times New Roman"/>
-          <w:color w:val="000000"/>
-          <w:sz w:val="20"/>
-          <w:szCs w:val="20"/>
-        </w:rPr>
-      </w:pPr>
-    </w:p>
-    <w:p>
-      <w:pPr>
-        <w:spacing w:line="240" w:lineRule="auto"/>
-        <w:rPr>
-          <w:rFonts w:hint="default" w:ascii="Times New Roman" w:hAnsi="Times New Roman" w:cs="Times New Roman"/>
-          <w:color w:val="000000"/>
-          <w:sz w:val="20"/>
-          <w:szCs w:val="20"/>
-        </w:rPr>
-      </w:pPr>
-      <w:r>
-        <w:rPr>
-          <w:rFonts w:hint="default" w:ascii="Times New Roman" w:hAnsi="Times New Roman" w:cs="Times New Roman"/>
-          <w:color w:val="000000"/>
-          <w:sz w:val="20"/>
-          <w:szCs w:val="20"/>
-        </w:rPr>
-        <w:t xml:space="preserve">              </w:t>
-      </w:r>
-    </w:p>
-    <w:p>
-      <w:pPr>
-        <w:spacing w:line="240" w:lineRule="auto"/>
-        <w:ind w:left="4248"/>
-        <w:rPr>
-          <w:rFonts w:hint="default" w:ascii="Times New Roman" w:hAnsi="Times New Roman" w:cs="Times New Roman"/>
-          <w:color w:val="000000"/>
-          <w:sz w:val="19"/>
-          <w:szCs w:val="19"/>
-        </w:rPr>
-      </w:pPr>
-      <w:r>
-        <w:rPr>
-          <w:rFonts w:hint="default" w:ascii="Times New Roman" w:hAnsi="Times New Roman" w:cs="Times New Roman"/>
-          <w:color w:val="000000"/>
-          <w:sz w:val="20"/>
-          <w:szCs w:val="20"/>
-        </w:rPr>
-        <w:t xml:space="preserve">                        </w:t>
-      </w:r>
-      <w:bookmarkStart w:id="0" w:name="_Hlk66701854"/>
-      <w:bookmarkStart w:id="1" w:name="_Hlk71183188"/>
-      <w:r>
-        <w:rPr>
-          <w:rFonts w:hint="default" w:ascii="Times New Roman" w:hAnsi="Times New Roman" w:cs="Times New Roman"/>
-          <w:color w:val="000000"/>
-          <w:sz w:val="19"/>
-          <w:szCs w:val="19"/>
-        </w:rPr>
-        <w:t>Lomé, le 18 Mars 2024</w:t>
-      </w:r>
-    </w:p>
-    <w:p>
-      <w:pPr>
-        <w:spacing w:after="0" w:line="240" w:lineRule="auto"/>
-        <w:ind w:left="5529" w:hanging="142"/>
+        <w:ind w:left="5664" w:leftChars="0" w:firstLine="708" w:firstLineChars="0"/>
         <w:rPr>
           <w:rFonts w:hint="default" w:ascii="Times New Roman" w:hAnsi="Times New Roman" w:cs="Times New Roman"/>
           <w:b/>
@@ -96,9 +48,9 @@
           <w:color w:val="000000"/>
           <w:sz w:val="19"/>
           <w:szCs w:val="19"/>
-        </w:rPr>
-      </w:pPr>
-      <w:bookmarkStart w:id="2" w:name="_Hlk78960790"/>
+          <w:lang w:val="en-US"/>
+        </w:rPr>
+      </w:pPr>
       <w:r>
         <w:rPr>
           <w:rFonts w:hint="default" w:ascii="Times New Roman" w:hAnsi="Times New Roman" w:cs="Times New Roman"/>
@@ -107,8 +59,9 @@
           <w:color w:val="000000"/>
           <w:sz w:val="19"/>
           <w:szCs w:val="19"/>
-        </w:rPr>
-        <w:t xml:space="preserve"> Monsieur </w:t>
+          <w:lang w:val="en-US"/>
+        </w:rPr>
+        <w:t>${verbal_trial.civility.2</w:t>
       </w:r>
       <w:bookmarkEnd w:id="2"/>
       <w:r>
@@ -119,14 +72,107 @@
           <w:color w:val="000000"/>
           <w:sz w:val="19"/>
           <w:szCs w:val="19"/>
-        </w:rPr>
-        <w:t xml:space="preserve">LARE KANFITINE </w:t>
-      </w:r>
-    </w:p>
-    <w:p>
-      <w:pPr>
-        <w:spacing w:after="0" w:line="240" w:lineRule="auto"/>
-        <w:ind w:left="4679" w:firstLine="708"/>
+          <w:lang w:val="en-US"/>
+        </w:rPr>
+        <w:t>} ${verbal_trial.applicant_full_name}</w:t>
+      </w:r>
+    </w:p>
+    <w:p>
+      <w:pPr>
+        <w:spacing w:line="240" w:lineRule="auto"/>
+        <w:ind w:left="5664" w:leftChars="0" w:firstLine="708" w:firstLineChars="0"/>
+        <w:rPr>
+          <w:rFonts w:hint="default" w:ascii="Times New Roman" w:hAnsi="Times New Roman" w:cs="Times New Roman"/>
+          <w:b/>
+          <w:bCs/>
+          <w:sz w:val="19"/>
+          <w:szCs w:val="19"/>
+          <w:lang w:val="en-US"/>
+        </w:rPr>
+      </w:pPr>
+      <w:r>
+        <w:rPr>
+          <w:rFonts w:hint="default" w:ascii="Times New Roman" w:hAnsi="Times New Roman" w:cs="Times New Roman"/>
+          <w:b/>
+          <w:bCs/>
+          <w:sz w:val="19"/>
+          <w:szCs w:val="19"/>
+        </w:rPr>
+        <w:t>Tel :</w:t>
+      </w:r>
+      <w:r>
+        <w:rPr>
+          <w:rFonts w:hint="default" w:ascii="Times New Roman" w:hAnsi="Times New Roman" w:cs="Times New Roman"/>
+          <w:b/>
+          <w:bCs/>
+          <w:sz w:val="19"/>
+          <w:szCs w:val="19"/>
+          <w:lang w:val="en-US"/>
+        </w:rPr>
+        <w:t xml:space="preserve"> ${representative_phone_number}</w:t>
+      </w:r>
+    </w:p>
+    <w:p>
+      <w:pPr>
+        <w:spacing w:line="240" w:lineRule="auto"/>
+        <w:ind w:left="5664" w:leftChars="0" w:firstLine="708" w:firstLineChars="0"/>
+        <w:rPr>
+          <w:rFonts w:hint="default" w:ascii="Times New Roman" w:hAnsi="Times New Roman" w:cs="Times New Roman"/>
+          <w:b/>
+          <w:bCs/>
+          <w:sz w:val="19"/>
+          <w:szCs w:val="19"/>
+          <w:lang w:val="en-US"/>
+        </w:rPr>
+      </w:pPr>
+      <w:r>
+        <w:rPr>
+          <w:rFonts w:hint="default" w:ascii="Times New Roman" w:hAnsi="Times New Roman" w:cs="Times New Roman"/>
+          <w:b/>
+          <w:bCs/>
+          <w:sz w:val="19"/>
+          <w:szCs w:val="19"/>
+          <w:lang w:val="en-US"/>
+        </w:rPr>
+        <w:t>Lomé – TOGO</w:t>
+      </w:r>
+    </w:p>
+    <w:p>
+      <w:pPr>
+        <w:spacing w:line="240" w:lineRule="auto"/>
+        <w:rPr>
+          <w:rFonts w:hint="default" w:ascii="Times New Roman" w:hAnsi="Times New Roman" w:cs="Times New Roman"/>
+          <w:b/>
+          <w:sz w:val="19"/>
+          <w:szCs w:val="19"/>
+          <w:lang w:val="en-US"/>
+        </w:rPr>
+      </w:pPr>
+      <w:r>
+        <w:rPr>
+          <w:rFonts w:hint="default" w:ascii="Times New Roman" w:hAnsi="Times New Roman" w:cs="Times New Roman"/>
+          <w:b/>
+          <w:sz w:val="19"/>
+          <w:szCs w:val="19"/>
+          <w:u w:val="single"/>
+          <w:lang w:val="en-US"/>
+        </w:rPr>
+        <w:t>N/Ref</w:t>
+      </w:r>
+      <w:r>
+        <w:rPr>
+          <w:rFonts w:hint="default" w:ascii="Times New Roman" w:hAnsi="Times New Roman" w:cs="Times New Roman"/>
+          <w:b/>
+          <w:sz w:val="19"/>
+          <w:szCs w:val="19"/>
+          <w:lang w:val="en-US"/>
+        </w:rPr>
+        <w:t xml:space="preserve">: ${verbal_trial.committee_id} </w:t>
+      </w:r>
+    </w:p>
+    <w:p>
+      <w:pPr>
+        <w:spacing w:line="240" w:lineRule="auto"/>
         <w:rPr>
           <w:rFonts w:hint="default" w:ascii="Times New Roman" w:hAnsi="Times New Roman" w:cs="Times New Roman"/>
           <w:b/>
@@ -139,74 +185,14 @@
         <w:rPr>
           <w:rFonts w:hint="default" w:ascii="Times New Roman" w:hAnsi="Times New Roman" w:cs="Times New Roman"/>
           <w:b/>
-          <w:bCs/>
-          <w:sz w:val="19"/>
-          <w:szCs w:val="19"/>
-        </w:rPr>
-        <w:t xml:space="preserve">Tel : +228 90 11 37 11 </w:t>
-      </w:r>
-    </w:p>
-    <w:p>
-      <w:pPr>
-        <w:spacing w:after="0" w:line="240" w:lineRule="auto"/>
-        <w:ind w:left="5387" w:hanging="311"/>
-        <w:rPr>
-          <w:rFonts w:hint="default" w:ascii="Times New Roman" w:hAnsi="Times New Roman" w:cs="Times New Roman"/>
-          <w:b/>
-          <w:bCs/>
-          <w:sz w:val="19"/>
-          <w:szCs w:val="19"/>
-          <w:lang w:val="en-US"/>
-        </w:rPr>
-      </w:pPr>
-      <w:r>
-        <w:rPr>
-          <w:rFonts w:hint="default" w:ascii="Times New Roman" w:hAnsi="Times New Roman" w:cs="Times New Roman"/>
-          <w:b/>
-          <w:bCs/>
-          <w:sz w:val="19"/>
-          <w:szCs w:val="19"/>
-          <w:lang w:val="en-US"/>
-        </w:rPr>
-        <w:t xml:space="preserve">       Lomé – TOGO</w:t>
-      </w:r>
-    </w:p>
-    <w:p>
-      <w:pPr>
-        <w:spacing w:line="240" w:lineRule="auto"/>
-        <w:rPr>
-          <w:rFonts w:hint="default" w:ascii="Times New Roman" w:hAnsi="Times New Roman" w:cs="Times New Roman"/>
-          <w:b/>
-          <w:sz w:val="19"/>
-          <w:szCs w:val="19"/>
-          <w:lang w:val="en-US"/>
-        </w:rPr>
-      </w:pPr>
-      <w:r>
-        <w:rPr>
-          <w:rFonts w:hint="default" w:ascii="Times New Roman" w:hAnsi="Times New Roman" w:cs="Times New Roman"/>
-          <w:b/>
+          <w:color w:val="000000"/>
           <w:sz w:val="19"/>
           <w:szCs w:val="19"/>
           <w:u w:val="single"/>
-          <w:lang w:val="en-US"/>
-        </w:rPr>
-        <w:t>N/Ref</w:t>
-      </w:r>
-      <w:r>
-        <w:rPr>
-          <w:rFonts w:hint="default" w:ascii="Times New Roman" w:hAnsi="Times New Roman" w:cs="Times New Roman"/>
-          <w:b/>
-          <w:sz w:val="19"/>
-          <w:szCs w:val="19"/>
-          <w:lang w:val="en-US"/>
-        </w:rPr>
-        <w:t xml:space="preserve">: CFNTG/DG/DC/MT/060/2024 </w:t>
-      </w:r>
-    </w:p>
-    <w:p>
-      <w:pPr>
-        <w:spacing w:line="240" w:lineRule="auto"/>
+        </w:rPr>
+        <w:t>Objet</w:t>
+      </w:r>
+      <w:r>
         <w:rPr>
           <w:rFonts w:hint="default" w:ascii="Times New Roman" w:hAnsi="Times New Roman" w:cs="Times New Roman"/>
           <w:b/>
@@ -214,50 +200,50 @@
           <w:sz w:val="19"/>
           <w:szCs w:val="19"/>
         </w:rPr>
-      </w:pPr>
-      <w:r>
-        <w:rPr>
-          <w:rFonts w:hint="default" w:ascii="Times New Roman" w:hAnsi="Times New Roman" w:cs="Times New Roman"/>
-          <w:b/>
+        <w:t xml:space="preserve"> : Notification de crédit </w:t>
+      </w:r>
+    </w:p>
+    <w:p>
+      <w:pPr>
+        <w:keepNext w:val="0"/>
+        <w:keepLines w:val="0"/>
+        <w:widowControl/>
+        <w:suppressLineNumbers w:val="0"/>
+        <w:spacing w:before="0" w:beforeAutospacing="1" w:after="200" w:afterAutospacing="0" w:line="273" w:lineRule="auto"/>
+        <w:ind w:right="0"/>
+        <w:jc w:val="left"/>
+        <w:rPr>
+          <w:rFonts w:hint="default" w:ascii="Times New Roman" w:hAnsi="Times New Roman" w:cs="Times New Roman"/>
           <w:color w:val="000000"/>
           <w:sz w:val="19"/>
           <w:szCs w:val="19"/>
-          <w:u w:val="single"/>
-        </w:rPr>
-        <w:t>Objet</w:t>
-      </w:r>
-      <w:r>
-        <w:rPr>
-          <w:rFonts w:hint="default" w:ascii="Times New Roman" w:hAnsi="Times New Roman" w:cs="Times New Roman"/>
-          <w:b/>
-          <w:color w:val="000000"/>
-          <w:sz w:val="19"/>
-          <w:szCs w:val="19"/>
-        </w:rPr>
-        <w:t xml:space="preserve"> : Notification de crédit </w:t>
-      </w:r>
-    </w:p>
-    <w:p>
-      <w:pPr>
-        <w:spacing w:line="240" w:lineRule="auto"/>
-        <w:jc w:val="both"/>
-        <w:rPr>
-          <w:rFonts w:hint="default" w:ascii="Times New Roman" w:hAnsi="Times New Roman" w:cs="Times New Roman"/>
-          <w:color w:val="000000"/>
-          <w:sz w:val="19"/>
-          <w:szCs w:val="19"/>
-        </w:rPr>
-      </w:pPr>
-      <w:r>
-        <w:rPr>
-          <w:rFonts w:hint="default" w:ascii="Times New Roman" w:hAnsi="Times New Roman" w:cs="Times New Roman"/>
+        </w:rPr>
+      </w:pPr>
+      <w:r>
+        <w:rPr>
+          <w:rFonts w:hint="default" w:ascii="Times New Roman" w:hAnsi="Times New Roman" w:eastAsia="Times New Roman" w:cs="Times New Roman"/>
           <w:b/>
           <w:bCs/>
           <w:color w:val="000000"/>
-          <w:sz w:val="19"/>
-          <w:szCs w:val="19"/>
-        </w:rPr>
-        <w:t>Monsieur ;</w:t>
+          <w:kern w:val="0"/>
+          <w:sz w:val="19"/>
+          <w:szCs w:val="19"/>
+          <w:lang w:val="en-US" w:eastAsia="zh-CN" w:bidi="ar"/>
+        </w:rPr>
+        <w:t>${verbal_trial.civility.2} ${verbal_trial.applicant_full_name}</w:t>
+      </w:r>
+      <w:bookmarkStart w:id="3" w:name="_GoBack"/>
+      <w:bookmarkEnd w:id="3"/>
+      <w:r>
+        <w:rPr>
+          <w:rFonts w:hint="default" w:ascii="Times New Roman" w:hAnsi="Times New Roman" w:cs="Times New Roman"/>
+          <w:b/>
+          <w:bCs/>
+          <w:color w:val="000000"/>
+          <w:sz w:val="19"/>
+          <w:szCs w:val="19"/>
+        </w:rPr>
+        <w:t xml:space="preserve"> ;</w:t>
       </w:r>
       <w:r>
         <w:rPr>
@@ -432,8 +418,6 @@
           <w:szCs w:val="19"/>
         </w:rPr>
       </w:pPr>
-      <w:bookmarkStart w:id="3" w:name="_GoBack"/>
-      <w:bookmarkEnd w:id="3"/>
     </w:p>
     <w:p>
       <w:pPr>
@@ -447,6 +431,73 @@
           <w:u w:val="single"/>
         </w:rPr>
       </w:pPr>
+    </w:p>
+    <w:p>
+      <w:pPr>
+        <w:spacing w:after="0" w:line="240" w:lineRule="auto"/>
+        <w:jc w:val="both"/>
+        <w:rPr>
+          <w:rFonts w:hint="default" w:ascii="Times New Roman" w:hAnsi="Times New Roman" w:cs="Times New Roman"/>
+          <w:b/>
+          <w:bCs/>
+          <w:color w:val="000000" w:themeColor="text1"/>
+          <w:sz w:val="20"/>
+          <w:szCs w:val="20"/>
+          <w:lang w:val="en-US"/>
+          <w14:textFill>
+            <w14:solidFill>
+              <w14:schemeClr w14:val="tx1"/>
+            </w14:solidFill>
+          </w14:textFill>
+        </w:rPr>
+      </w:pPr>
+      <w:r>
+        <w:rPr>
+          <w:rFonts w:hint="default" w:ascii="Times New Roman" w:hAnsi="Times New Roman" w:cs="Times New Roman"/>
+          <w:b/>
+          <w:sz w:val="19"/>
+          <w:szCs w:val="19"/>
+          <w:u w:val="single"/>
+        </w:rPr>
+        <w:t>Type de concours</w:t>
+      </w:r>
+      <w:r>
+        <w:rPr>
+          <w:rFonts w:hint="default" w:ascii="Times New Roman" w:hAnsi="Times New Roman" w:cs="Times New Roman"/>
+          <w:b/>
+          <w:sz w:val="19"/>
+          <w:szCs w:val="19"/>
+        </w:rPr>
+        <w:t> </w:t>
+      </w:r>
+      <w:r>
+        <w:rPr>
+          <w:rFonts w:hint="default" w:ascii="Times New Roman" w:hAnsi="Times New Roman" w:cs="Times New Roman"/>
+          <w:sz w:val="19"/>
+          <w:szCs w:val="19"/>
+        </w:rPr>
+        <w:t>:</w:t>
+      </w:r>
+      <w:r>
+        <w:rPr>
+          <w:rFonts w:hint="default" w:ascii="Times New Roman" w:hAnsi="Times New Roman" w:cs="Times New Roman"/>
+          <w:b/>
+          <w:sz w:val="19"/>
+          <w:szCs w:val="19"/>
+        </w:rPr>
+        <w:t xml:space="preserve"> </w:t>
+      </w:r>
+      <w:r>
+        <w:rPr>
+          <w:rFonts w:hint="default" w:ascii="Times New Roman" w:hAnsi="Times New Roman" w:cs="Times New Roman"/>
+          <w:b/>
+          <w:bCs w:val="0"/>
+          <w:sz w:val="19"/>
+          <w:szCs w:val="19"/>
+          <w:lang w:val="en-US"/>
+        </w:rPr>
+        <w:t>${verbal_trial.type_of_credit.name}</w:t>
+      </w:r>
     </w:p>
     <w:p>
       <w:pPr>
@@ -469,94 +520,6 @@
       <w:r>
         <w:rPr>
           <w:rFonts w:hint="default" w:ascii="Times New Roman" w:hAnsi="Times New Roman" w:cs="Times New Roman"/>
-          <w:b/>
-          <w:sz w:val="19"/>
-          <w:szCs w:val="19"/>
-          <w:u w:val="single"/>
-        </w:rPr>
-        <w:t>Type de concours</w:t>
-      </w:r>
-      <w:r>
-        <w:rPr>
-          <w:rFonts w:hint="default" w:ascii="Times New Roman" w:hAnsi="Times New Roman" w:cs="Times New Roman"/>
-          <w:b/>
-          <w:sz w:val="19"/>
-          <w:szCs w:val="19"/>
-        </w:rPr>
-        <w:t> </w:t>
-      </w:r>
-      <w:r>
-        <w:rPr>
-          <w:rFonts w:hint="default" w:ascii="Times New Roman" w:hAnsi="Times New Roman" w:cs="Times New Roman"/>
-          <w:sz w:val="19"/>
-          <w:szCs w:val="19"/>
-        </w:rPr>
-        <w:t>:</w:t>
-      </w:r>
-      <w:r>
-        <w:rPr>
-          <w:rFonts w:hint="default" w:ascii="Times New Roman" w:hAnsi="Times New Roman" w:cs="Times New Roman"/>
-          <w:b/>
-          <w:sz w:val="19"/>
-          <w:szCs w:val="19"/>
-        </w:rPr>
-        <w:t xml:space="preserve"> </w:t>
-      </w:r>
-      <w:r>
-        <w:rPr>
-          <w:rFonts w:hint="default" w:ascii="Times New Roman" w:hAnsi="Times New Roman" w:cs="Times New Roman"/>
-          <w:b/>
-          <w:bCs/>
-          <w:color w:val="000000" w:themeColor="text1"/>
-          <w:sz w:val="20"/>
-          <w:szCs w:val="20"/>
-          <w:highlight w:val="yellow"/>
-          <w14:textFill>
-            <w14:solidFill>
-              <w14:schemeClr w14:val="tx1"/>
-            </w14:solidFill>
-          </w14:textFill>
-        </w:rPr>
-        <w:t>CREDIT INVESTISSEMENT</w:t>
-      </w:r>
-      <w:r>
-        <w:rPr>
-          <w:rFonts w:hint="default" w:ascii="Times New Roman" w:hAnsi="Times New Roman" w:cs="Times New Roman"/>
-          <w:b/>
-          <w:bCs/>
-          <w:color w:val="000000" w:themeColor="text1"/>
-          <w:sz w:val="20"/>
-          <w:szCs w:val="20"/>
-          <w14:textFill>
-            <w14:solidFill>
-              <w14:schemeClr w14:val="tx1"/>
-            </w14:solidFill>
-          </w14:textFill>
-        </w:rPr>
-        <w:t xml:space="preserve"> </w:t>
-      </w:r>
-    </w:p>
-    <w:p>
-      <w:pPr>
-        <w:spacing w:after="0" w:line="240" w:lineRule="auto"/>
-        <w:jc w:val="both"/>
-        <w:rPr>
-          <w:rFonts w:hint="default" w:ascii="Times New Roman" w:hAnsi="Times New Roman" w:cs="Times New Roman"/>
-          <w:b/>
-          <w:bCs/>
-          <w:color w:val="000000" w:themeColor="text1"/>
-          <w:sz w:val="20"/>
-          <w:szCs w:val="20"/>
-          <w14:textFill>
-            <w14:solidFill>
-              <w14:schemeClr w14:val="tx1"/>
-            </w14:solidFill>
-          </w14:textFill>
-        </w:rPr>
-      </w:pPr>
-      <w:r>
-        <w:rPr>
-          <w:rFonts w:hint="default" w:ascii="Times New Roman" w:hAnsi="Times New Roman" w:cs="Times New Roman"/>
           <w:sz w:val="19"/>
           <w:szCs w:val="19"/>
         </w:rPr>
@@ -584,7 +547,104 @@
           <w:sz w:val="19"/>
           <w:szCs w:val="19"/>
         </w:rPr>
-        <w:t>Montant                                                                 : 25 000 0000 F CFA</w:t>
+        <w:t>Montan</w:t>
+      </w:r>
+      <w:r>
+        <w:rPr>
+          <w:rFonts w:hint="default" w:ascii="Times New Roman" w:hAnsi="Times New Roman" w:cs="Times New Roman"/>
+          <w:sz w:val="19"/>
+          <w:szCs w:val="19"/>
+          <w:lang w:val="en-US"/>
+        </w:rPr>
+        <w:t>t</w:t>
+      </w:r>
+      <w:r>
+        <w:rPr>
+          <w:rFonts w:hint="default" w:ascii="Times New Roman" w:hAnsi="Times New Roman" w:cs="Times New Roman"/>
+          <w:sz w:val="19"/>
+          <w:szCs w:val="19"/>
+          <w:lang w:val="en-US"/>
+        </w:rPr>
+        <w:tab/>
+      </w:r>
+      <w:r>
+        <w:rPr>
+          <w:rFonts w:hint="default" w:ascii="Times New Roman" w:hAnsi="Times New Roman" w:cs="Times New Roman"/>
+          <w:sz w:val="19"/>
+          <w:szCs w:val="19"/>
+          <w:lang w:val="en-US"/>
+        </w:rPr>
+        <w:tab/>
+      </w:r>
+      <w:r>
+        <w:rPr>
+          <w:rFonts w:hint="default" w:ascii="Times New Roman" w:hAnsi="Times New Roman" w:cs="Times New Roman"/>
+          <w:sz w:val="19"/>
+          <w:szCs w:val="19"/>
+          <w:lang w:val="en-US"/>
+        </w:rPr>
+        <w:tab/>
+      </w:r>
+      <w:r>
+        <w:rPr>
+          <w:rFonts w:hint="default" w:ascii="Times New Roman" w:hAnsi="Times New Roman" w:cs="Times New Roman"/>
+          <w:sz w:val="19"/>
+          <w:szCs w:val="19"/>
+          <w:lang w:val="en-US"/>
+        </w:rPr>
+        <w:tab/>
+      </w:r>
+      <w:r>
+        <w:rPr>
+          <w:rFonts w:hint="default" w:ascii="Times New Roman" w:hAnsi="Times New Roman" w:cs="Times New Roman"/>
+          <w:sz w:val="19"/>
+          <w:szCs w:val="19"/>
+          <w:lang w:val="en-US"/>
+        </w:rPr>
+        <w:tab/>
+      </w:r>
+      <w:r>
+        <w:rPr>
+          <w:rFonts w:hint="default" w:ascii="Times New Roman" w:hAnsi="Times New Roman" w:cs="Times New Roman"/>
+          <w:sz w:val="19"/>
+          <w:szCs w:val="19"/>
+          <w:lang w:val="en-US"/>
+        </w:rPr>
+        <w:tab/>
+      </w:r>
+      <w:r>
+        <w:rPr>
+          <w:rFonts w:hint="default" w:ascii="Times New Roman" w:hAnsi="Times New Roman" w:cs="Times New Roman"/>
+          <w:sz w:val="19"/>
+          <w:szCs w:val="19"/>
+          <w:lang w:val="en-US"/>
+        </w:rPr>
+        <w:tab/>
+      </w:r>
+      <w:r>
+        <w:rPr>
+          <w:rFonts w:hint="default" w:ascii="Times New Roman" w:hAnsi="Times New Roman" w:cs="Times New Roman"/>
+          <w:sz w:val="19"/>
+          <w:szCs w:val="19"/>
+        </w:rPr>
+        <w:t xml:space="preserve">: </w:t>
+      </w:r>
+      <w:r>
+        <w:rPr>
+          <w:rFonts w:hint="default" w:ascii="Times New Roman" w:hAnsi="Times New Roman" w:cs="Times New Roman"/>
+          <w:sz w:val="19"/>
+          <w:szCs w:val="19"/>
+          <w:lang w:val="en-US"/>
+        </w:rPr>
+        <w:t>${verbal_trial.amount}</w:t>
+      </w:r>
+      <w:r>
+        <w:rPr>
+          <w:rFonts w:hint="default" w:ascii="Times New Roman" w:hAnsi="Times New Roman" w:cs="Times New Roman"/>
+          <w:sz w:val="19"/>
+          <w:szCs w:val="19"/>
+        </w:rPr>
+        <w:t xml:space="preserve"> F CFA</w:t>
       </w:r>
     </w:p>
     <w:p>
@@ -608,7 +668,95 @@
           <w:sz w:val="19"/>
           <w:szCs w:val="19"/>
         </w:rPr>
-        <w:t xml:space="preserve">Durée                                                                     : 36 mois </w:t>
+        <w:t>Durée</w:t>
+      </w:r>
+      <w:r>
+        <w:rPr>
+          <w:rFonts w:hint="default" w:ascii="Times New Roman" w:hAnsi="Times New Roman" w:cs="Times New Roman"/>
+          <w:sz w:val="19"/>
+          <w:szCs w:val="19"/>
+          <w:lang w:val="en-US"/>
+        </w:rPr>
+        <w:tab/>
+      </w:r>
+      <w:r>
+        <w:rPr>
+          <w:rFonts w:hint="default" w:ascii="Times New Roman" w:hAnsi="Times New Roman" w:cs="Times New Roman"/>
+          <w:sz w:val="19"/>
+          <w:szCs w:val="19"/>
+          <w:lang w:val="en-US"/>
+        </w:rPr>
+        <w:tab/>
+      </w:r>
+      <w:r>
+        <w:rPr>
+          <w:rFonts w:hint="default" w:ascii="Times New Roman" w:hAnsi="Times New Roman" w:cs="Times New Roman"/>
+          <w:sz w:val="19"/>
+          <w:szCs w:val="19"/>
+          <w:lang w:val="en-US"/>
+        </w:rPr>
+        <w:tab/>
+      </w:r>
+      <w:r>
+        <w:rPr>
+          <w:rFonts w:hint="default" w:ascii="Times New Roman" w:hAnsi="Times New Roman" w:cs="Times New Roman"/>
+          <w:sz w:val="19"/>
+          <w:szCs w:val="19"/>
+          <w:lang w:val="en-US"/>
+        </w:rPr>
+        <w:tab/>
+      </w:r>
+      <w:r>
+        <w:rPr>
+          <w:rFonts w:hint="default" w:ascii="Times New Roman" w:hAnsi="Times New Roman" w:cs="Times New Roman"/>
+          <w:sz w:val="19"/>
+          <w:szCs w:val="19"/>
+          <w:lang w:val="en-US"/>
+        </w:rPr>
+        <w:tab/>
+      </w:r>
+      <w:r>
+        <w:rPr>
+          <w:rFonts w:hint="default" w:ascii="Times New Roman" w:hAnsi="Times New Roman" w:cs="Times New Roman"/>
+          <w:sz w:val="19"/>
+          <w:szCs w:val="19"/>
+          <w:lang w:val="en-US"/>
+        </w:rPr>
+        <w:tab/>
+      </w:r>
+      <w:r>
+        <w:rPr>
+          <w:rFonts w:hint="default" w:ascii="Times New Roman" w:hAnsi="Times New Roman" w:cs="Times New Roman"/>
+          <w:sz w:val="19"/>
+          <w:szCs w:val="19"/>
+          <w:lang w:val="en-US"/>
+        </w:rPr>
+        <w:tab/>
+      </w:r>
+      <w:r>
+        <w:rPr>
+          <w:rFonts w:hint="default" w:ascii="Times New Roman" w:hAnsi="Times New Roman" w:cs="Times New Roman"/>
+          <w:sz w:val="19"/>
+          <w:szCs w:val="19"/>
+        </w:rPr>
+        <w:t xml:space="preserve">: </w:t>
+      </w:r>
+      <w:r>
+        <w:rPr>
+          <w:rFonts w:hint="default" w:ascii="Times New Roman" w:hAnsi="Times New Roman" w:cs="Times New Roman"/>
+          <w:sz w:val="19"/>
+          <w:szCs w:val="19"/>
+          <w:lang w:val="en-US"/>
+        </w:rPr>
+        <w:t>${verbal_trial.duration}</w:t>
+      </w:r>
+      <w:r>
+        <w:rPr>
+          <w:rFonts w:hint="default" w:ascii="Times New Roman" w:hAnsi="Times New Roman" w:cs="Times New Roman"/>
+          <w:sz w:val="19"/>
+          <w:szCs w:val="19"/>
+        </w:rPr>
+        <w:t xml:space="preserve"> mois </w:t>
       </w:r>
     </w:p>
     <w:p>
@@ -632,7 +780,42 @@
           <w:sz w:val="19"/>
           <w:szCs w:val="19"/>
         </w:rPr>
-        <w:t>Périodicité                                                              : Mensuelle</w:t>
+        <w:t xml:space="preserve">Périodicité                              </w:t>
+      </w:r>
+      <w:r>
+        <w:rPr>
+          <w:rFonts w:hint="default" w:ascii="Times New Roman" w:hAnsi="Times New Roman" w:cs="Times New Roman"/>
+          <w:sz w:val="19"/>
+          <w:szCs w:val="19"/>
+          <w:lang w:val="en-US"/>
+        </w:rPr>
+        <w:tab/>
+      </w:r>
+      <w:r>
+        <w:rPr>
+          <w:rFonts w:hint="default" w:ascii="Times New Roman" w:hAnsi="Times New Roman" w:cs="Times New Roman"/>
+          <w:sz w:val="19"/>
+          <w:szCs w:val="19"/>
+          <w:lang w:val="en-US"/>
+        </w:rPr>
+        <w:tab/>
+      </w:r>
+      <w:r>
+        <w:rPr>
+          <w:rFonts w:hint="default" w:ascii="Times New Roman" w:hAnsi="Times New Roman" w:cs="Times New Roman"/>
+          <w:sz w:val="19"/>
+          <w:szCs w:val="19"/>
+        </w:rPr>
+        <w:t xml:space="preserve">: </w:t>
+      </w:r>
+      <w:r>
+        <w:rPr>
+          <w:rFonts w:hint="default" w:ascii="Times New Roman" w:hAnsi="Times New Roman" w:cs="Times New Roman"/>
+          <w:sz w:val="19"/>
+          <w:szCs w:val="19"/>
+          <w:lang w:val="en-US"/>
+        </w:rPr>
+        <w:t>${verbal_trial.duration.fr}</w:t>
       </w:r>
     </w:p>
     <w:p>
@@ -656,7 +839,41 @@
           <w:sz w:val="19"/>
           <w:szCs w:val="19"/>
         </w:rPr>
-        <w:t>Taux d’Intérêt HT                                                 : 17%</w:t>
+        <w:t xml:space="preserve">Taux d’Intérêt HT                                   </w:t>
+      </w:r>
+      <w:r>
+        <w:rPr>
+          <w:rFonts w:hint="default" w:ascii="Times New Roman" w:hAnsi="Times New Roman" w:cs="Times New Roman"/>
+          <w:sz w:val="19"/>
+          <w:szCs w:val="19"/>
+          <w:lang w:val="en-US"/>
+        </w:rPr>
+        <w:tab/>
+      </w:r>
+      <w:r>
+        <w:rPr>
+          <w:rFonts w:hint="default" w:ascii="Times New Roman" w:hAnsi="Times New Roman" w:cs="Times New Roman"/>
+          <w:sz w:val="19"/>
+          <w:szCs w:val="19"/>
+        </w:rPr>
+        <w:t xml:space="preserve">: </w:t>
+      </w:r>
+      <w:r>
+        <w:rPr>
+          <w:rFonts w:hint="default" w:ascii="Times New Roman" w:hAnsi="Times New Roman" w:cs="Times New Roman"/>
+          <w:sz w:val="19"/>
+          <w:szCs w:val="19"/>
+          <w:lang w:val="en-US"/>
+        </w:rPr>
+        <w:t>${verbal_trial.tax_fee_interest_rate}</w:t>
+      </w:r>
+      <w:r>
+        <w:rPr>
+          <w:rFonts w:hint="default" w:ascii="Times New Roman" w:hAnsi="Times New Roman" w:cs="Times New Roman"/>
+          <w:sz w:val="19"/>
+          <w:szCs w:val="19"/>
+        </w:rPr>
+        <w:t>%</w:t>
       </w:r>
     </w:p>
     <w:p>
@@ -680,7 +897,41 @@
           <w:sz w:val="19"/>
           <w:szCs w:val="19"/>
         </w:rPr>
-        <w:t>TAF                                                                       : 10%</w:t>
+        <w:t xml:space="preserve">TAF                                               </w:t>
+      </w:r>
+      <w:r>
+        <w:rPr>
+          <w:rFonts w:hint="default" w:ascii="Times New Roman" w:hAnsi="Times New Roman" w:cs="Times New Roman"/>
+          <w:sz w:val="19"/>
+          <w:szCs w:val="19"/>
+          <w:lang w:val="en-US"/>
+        </w:rPr>
+        <w:tab/>
+      </w:r>
+      <w:r>
+        <w:rPr>
+          <w:rFonts w:hint="default" w:ascii="Times New Roman" w:hAnsi="Times New Roman" w:cs="Times New Roman"/>
+          <w:sz w:val="19"/>
+          <w:szCs w:val="19"/>
+        </w:rPr>
+        <w:t xml:space="preserve">: </w:t>
+      </w:r>
+      <w:r>
+        <w:rPr>
+          <w:rFonts w:hint="default" w:ascii="Times New Roman" w:hAnsi="Times New Roman" w:cs="Times New Roman"/>
+          <w:sz w:val="19"/>
+          <w:szCs w:val="19"/>
+          <w:lang w:val="en-US"/>
+        </w:rPr>
+        <w:t>${verbal_trial.taf}</w:t>
+      </w:r>
+      <w:r>
+        <w:rPr>
+          <w:rFonts w:hint="default" w:ascii="Times New Roman" w:hAnsi="Times New Roman" w:cs="Times New Roman"/>
+          <w:sz w:val="19"/>
+          <w:szCs w:val="19"/>
+        </w:rPr>
+        <w:t>%</w:t>
       </w:r>
     </w:p>
     <w:p>
@@ -704,31 +955,94 @@
           <w:sz w:val="19"/>
           <w:szCs w:val="19"/>
         </w:rPr>
-        <w:t>Frais de dossier (2.79%)                                         : 697 500 F CFA</w:t>
-      </w:r>
-    </w:p>
-    <w:p>
-      <w:pPr>
-        <w:numPr>
-          <w:ilvl w:val="0"/>
-          <w:numId w:val="1"/>
-        </w:numPr>
-        <w:spacing w:after="0" w:line="240" w:lineRule="auto"/>
-        <w:ind w:right="57"/>
-        <w:jc w:val="both"/>
-        <w:rPr>
-          <w:rFonts w:hint="default" w:ascii="Times New Roman" w:hAnsi="Times New Roman" w:cs="Times New Roman"/>
-          <w:sz w:val="19"/>
-          <w:szCs w:val="19"/>
-        </w:rPr>
-      </w:pPr>
-      <w:r>
-        <w:rPr>
-          <w:rFonts w:hint="default" w:ascii="Times New Roman" w:hAnsi="Times New Roman" w:cs="Times New Roman"/>
-          <w:sz w:val="19"/>
-          <w:szCs w:val="19"/>
-        </w:rPr>
-        <w:t>Prime de risque (1%)                                             : 250 000 F CFA</w:t>
+        <w:t>Frais de dossier</w:t>
+      </w:r>
+      <w:r>
+        <w:rPr>
+          <w:rFonts w:hint="default" w:ascii="Times New Roman" w:hAnsi="Times New Roman" w:cs="Times New Roman"/>
+          <w:sz w:val="19"/>
+          <w:szCs w:val="19"/>
+          <w:lang w:val="en-US"/>
+        </w:rPr>
+        <w:t xml:space="preserve"> Hors Taxe</w:t>
+      </w:r>
+      <w:r>
+        <w:rPr>
+          <w:rFonts w:hint="default" w:ascii="Times New Roman" w:hAnsi="Times New Roman" w:cs="Times New Roman"/>
+          <w:sz w:val="19"/>
+          <w:szCs w:val="19"/>
+        </w:rPr>
+        <w:t>(</w:t>
+      </w:r>
+      <w:r>
+        <w:rPr>
+          <w:rFonts w:hint="default" w:ascii="Times New Roman" w:hAnsi="Times New Roman" w:cs="Times New Roman"/>
+          <w:sz w:val="19"/>
+          <w:szCs w:val="19"/>
+          <w:lang w:val="en-US"/>
+        </w:rPr>
+        <w:t>${verbal_trial.administrative_fees_percentage}</w:t>
+      </w:r>
+      <w:r>
+        <w:rPr>
+          <w:rFonts w:hint="default" w:ascii="Times New Roman" w:hAnsi="Times New Roman" w:cs="Times New Roman"/>
+          <w:sz w:val="19"/>
+          <w:szCs w:val="19"/>
+        </w:rPr>
+        <w:t>%)</w:t>
+      </w:r>
+      <w:r>
+        <w:rPr>
+          <w:rFonts w:hint="default" w:ascii="Times New Roman" w:hAnsi="Times New Roman" w:cs="Times New Roman"/>
+          <w:sz w:val="19"/>
+          <w:szCs w:val="19"/>
+          <w:lang w:val="en-US"/>
+        </w:rPr>
+        <w:tab/>
+      </w:r>
+      <w:r>
+        <w:rPr>
+          <w:rFonts w:hint="default" w:ascii="Times New Roman" w:hAnsi="Times New Roman" w:cs="Times New Roman"/>
+          <w:sz w:val="19"/>
+          <w:szCs w:val="19"/>
+          <w:lang w:val="en-US"/>
+        </w:rPr>
+        <w:tab/>
+      </w:r>
+      <w:r>
+        <w:rPr>
+          <w:rFonts w:hint="default" w:ascii="Times New Roman" w:hAnsi="Times New Roman" w:cs="Times New Roman"/>
+          <w:sz w:val="19"/>
+          <w:szCs w:val="19"/>
+          <w:lang w:val="en-US"/>
+        </w:rPr>
+        <w:tab/>
+      </w:r>
+      <w:r>
+        <w:rPr>
+          <w:rFonts w:hint="default" w:ascii="Times New Roman" w:hAnsi="Times New Roman" w:cs="Times New Roman"/>
+          <w:sz w:val="19"/>
+          <w:szCs w:val="19"/>
+          <w:lang w:val="en-US"/>
+        </w:rPr>
+        <w:tab/>
+      </w:r>
+      <w:r>
+        <w:rPr>
+          <w:rFonts w:hint="default" w:ascii="Times New Roman" w:hAnsi="Times New Roman" w:cs="Times New Roman"/>
+          <w:sz w:val="19"/>
+          <w:szCs w:val="19"/>
+          <w:lang w:val="en-US"/>
+        </w:rPr>
+        <w:t>: ${verbal_trial.administrative_fees_percentage.value}</w:t>
+      </w:r>
+      <w:r>
+        <w:rPr>
+          <w:rFonts w:hint="default" w:ascii="Times New Roman" w:hAnsi="Times New Roman" w:cs="Times New Roman"/>
+          <w:sz w:val="19"/>
+          <w:szCs w:val="19"/>
+        </w:rPr>
+        <w:t xml:space="preserve"> F CFA</w:t>
       </w:r>
     </w:p>
     <w:p>
@@ -749,48 +1063,9 @@
           <w:rFonts w:hint="default" w:ascii="Times New Roman" w:hAnsi="Times New Roman" w:cs="Times New Roman"/>
           <w:sz w:val="19"/>
           <w:szCs w:val="19"/>
-        </w:rPr>
-        <w:t>Prime de révision de ligne</w:t>
-      </w:r>
-      <w:r>
-        <w:rPr>
-          <w:rFonts w:hint="default" w:ascii="Times New Roman" w:hAnsi="Times New Roman" w:cs="Times New Roman"/>
-          <w:sz w:val="19"/>
-          <w:szCs w:val="19"/>
-        </w:rPr>
-        <w:tab/>
-      </w:r>
-      <w:r>
-        <w:rPr>
-          <w:rFonts w:hint="default" w:ascii="Times New Roman" w:hAnsi="Times New Roman" w:cs="Times New Roman"/>
-          <w:sz w:val="19"/>
-          <w:szCs w:val="19"/>
-        </w:rPr>
-        <w:tab/>
-      </w:r>
-      <w:r>
-        <w:rPr>
-          <w:rFonts w:hint="default" w:ascii="Times New Roman" w:hAnsi="Times New Roman" w:cs="Times New Roman"/>
-          <w:sz w:val="19"/>
-          <w:szCs w:val="19"/>
-        </w:rPr>
-        <w:t xml:space="preserve">   </w:t>
-      </w:r>
-      <w:r>
-        <w:rPr>
-          <w:rFonts w:hint="default" w:ascii="Times New Roman" w:hAnsi="Times New Roman" w:cs="Times New Roman"/>
-          <w:sz w:val="19"/>
-          <w:szCs w:val="19"/>
-        </w:rPr>
-        <w:tab/>
-      </w:r>
-      <w:r>
-        <w:rPr>
-          <w:rFonts w:hint="default" w:ascii="Times New Roman" w:hAnsi="Times New Roman" w:cs="Times New Roman"/>
-          <w:sz w:val="19"/>
-          <w:szCs w:val="19"/>
-        </w:rPr>
-        <w:t xml:space="preserve">    : 1% du capital restant dû après 12 mois</w:t>
+          <w:lang w:val="en-US"/>
+        </w:rPr>
+        <w:t>${line_review_bonus}</w:t>
       </w:r>
     </w:p>
     <w:p>
@@ -848,6 +1123,25 @@
           <w:u w:val="single"/>
         </w:rPr>
       </w:pPr>
+    </w:p>
+    <w:p>
+      <w:pPr>
+        <w:spacing w:line="240" w:lineRule="auto"/>
+        <w:jc w:val="both"/>
+        <w:rPr>
+          <w:rFonts w:hint="default" w:ascii="Times New Roman" w:hAnsi="Times New Roman" w:cs="Times New Roman"/>
+          <w:sz w:val="24"/>
+          <w:szCs w:val="24"/>
+        </w:rPr>
+      </w:pPr>
+      <w:r>
+        <w:rPr>
+          <w:rFonts w:hint="default" w:ascii="Times New Roman" w:hAnsi="Times New Roman" w:cs="Times New Roman"/>
+          <w:sz w:val="24"/>
+          <w:szCs w:val="24"/>
+        </w:rPr>
+        <w:t>${guaranteeList}</w:t>
+      </w:r>
     </w:p>
     <w:p>
       <w:pPr>
@@ -855,118 +1149,58 @@
           <w:ilvl w:val="0"/>
           <w:numId w:val="2"/>
         </w:numPr>
-        <w:spacing w:after="0" w:line="240" w:lineRule="auto"/>
-        <w:ind w:right="57"/>
+        <w:spacing w:line="240" w:lineRule="auto"/>
         <w:jc w:val="both"/>
         <w:rPr>
           <w:rFonts w:hint="default" w:ascii="Times New Roman" w:hAnsi="Times New Roman" w:cs="Times New Roman"/>
-          <w:sz w:val="19"/>
-          <w:szCs w:val="19"/>
-        </w:rPr>
-      </w:pPr>
-      <w:r>
-        <w:rPr>
-          <w:rFonts w:hint="default" w:ascii="Times New Roman" w:hAnsi="Times New Roman" w:cs="Times New Roman"/>
-          <w:sz w:val="19"/>
-          <w:szCs w:val="19"/>
-        </w:rPr>
-        <w:t>Dépôt de garantie et compte de réserve du service de la dette (DG + CRSD) à hauteur de 10% du montant sollicité soit F CFA 2 500 000 ;</w:t>
-      </w:r>
-    </w:p>
-    <w:p>
-      <w:pPr>
-        <w:numPr>
-          <w:ilvl w:val="0"/>
-          <w:numId w:val="2"/>
-        </w:numPr>
-        <w:spacing w:after="0" w:line="240" w:lineRule="auto"/>
-        <w:ind w:right="57"/>
+          <w:sz w:val="24"/>
+          <w:szCs w:val="24"/>
+        </w:rPr>
+      </w:pPr>
+      <w:r>
+        <w:rPr>
+          <w:rFonts w:hint="default" w:ascii="Times New Roman" w:hAnsi="Times New Roman" w:cs="Times New Roman"/>
+          <w:sz w:val="24"/>
+          <w:szCs w:val="24"/>
+        </w:rPr>
+        <w:t>${type_of_guarantee.name} de ${value}</w:t>
+      </w:r>
+      <w:r>
+        <w:rPr>
+          <w:rFonts w:hint="default" w:ascii="Times New Roman" w:hAnsi="Times New Roman" w:cs="Times New Roman"/>
+          <w:sz w:val="24"/>
+          <w:szCs w:val="24"/>
+          <w:lang w:val="en-US"/>
+        </w:rPr>
+        <w:t xml:space="preserve"> FCFA: </w:t>
+      </w:r>
+      <w:r>
+        <w:rPr>
+          <w:rFonts w:hint="default" w:ascii="Times New Roman" w:hAnsi="Times New Roman" w:cs="Times New Roman"/>
+          <w:sz w:val="24"/>
+          <w:szCs w:val="24"/>
+        </w:rPr>
+        <w:t> ${comment}</w:t>
+      </w:r>
+    </w:p>
+    <w:p>
+      <w:pPr>
+        <w:spacing w:line="240" w:lineRule="auto"/>
         <w:jc w:val="both"/>
         <w:rPr>
-          <w:rFonts w:hint="default" w:ascii="Times New Roman" w:hAnsi="Times New Roman" w:cs="Times New Roman"/>
-          <w:sz w:val="19"/>
-          <w:szCs w:val="19"/>
-        </w:rPr>
-      </w:pPr>
-      <w:r>
-        <w:rPr>
-          <w:rFonts w:hint="default" w:ascii="Times New Roman" w:hAnsi="Times New Roman" w:cs="Times New Roman"/>
-          <w:sz w:val="19"/>
-          <w:szCs w:val="19"/>
-        </w:rPr>
-        <w:t>Caution personnelle et solidaire de NYASENU KOKOU HUBERT et de LAMBONI D. DAMETAME ;</w:t>
-      </w:r>
-    </w:p>
-    <w:p>
-      <w:pPr>
-        <w:numPr>
-          <w:ilvl w:val="0"/>
-          <w:numId w:val="2"/>
-        </w:numPr>
-        <w:spacing w:after="0" w:line="240" w:lineRule="auto"/>
-        <w:ind w:right="57"/>
-        <w:jc w:val="both"/>
-        <w:rPr>
-          <w:rFonts w:hint="default" w:ascii="Times New Roman" w:hAnsi="Times New Roman" w:cs="Times New Roman"/>
-          <w:sz w:val="19"/>
-          <w:szCs w:val="19"/>
-        </w:rPr>
-      </w:pPr>
-      <w:r>
-        <w:rPr>
-          <w:rFonts w:hint="default" w:ascii="Times New Roman" w:hAnsi="Times New Roman" w:cs="Times New Roman"/>
-          <w:sz w:val="19"/>
-          <w:szCs w:val="19"/>
-        </w:rPr>
-        <w:t xml:space="preserve">Hypothèque ferme de 1er rang sous condition suspensive sur l’immeuble objet de la REQUISITION 100498-GL sis à Lomé AGOE DALIKO appartenant à Monsieur KONLAMBIGUE KOINANGUE ; </w:t>
-      </w:r>
-    </w:p>
-    <w:p>
-      <w:pPr>
-        <w:numPr>
-          <w:ilvl w:val="0"/>
-          <w:numId w:val="2"/>
-        </w:numPr>
-        <w:spacing w:after="0" w:line="240" w:lineRule="auto"/>
-        <w:ind w:right="57"/>
-        <w:jc w:val="both"/>
-        <w:rPr>
-          <w:rFonts w:hint="default" w:ascii="Times New Roman" w:hAnsi="Times New Roman" w:cs="Times New Roman"/>
-          <w:sz w:val="19"/>
-          <w:szCs w:val="19"/>
-        </w:rPr>
-      </w:pPr>
-      <w:r>
-        <w:rPr>
-          <w:rFonts w:hint="default" w:ascii="Times New Roman" w:hAnsi="Times New Roman" w:cs="Times New Roman"/>
-          <w:sz w:val="19"/>
-          <w:szCs w:val="19"/>
-        </w:rPr>
-        <w:t>Signature de Convention de crédit ;</w:t>
-      </w:r>
-    </w:p>
-    <w:p>
-      <w:pPr>
-        <w:numPr>
-          <w:ilvl w:val="0"/>
-          <w:numId w:val="2"/>
-        </w:numPr>
-        <w:spacing w:after="0" w:line="240" w:lineRule="auto"/>
-        <w:ind w:right="57"/>
-        <w:jc w:val="both"/>
-        <w:rPr>
-          <w:rFonts w:hint="default" w:ascii="Times New Roman" w:hAnsi="Times New Roman" w:cs="Times New Roman"/>
-          <w:sz w:val="19"/>
-          <w:szCs w:val="19"/>
-        </w:rPr>
-      </w:pPr>
-      <w:r>
-        <w:rPr>
-          <w:rFonts w:hint="default" w:ascii="Times New Roman" w:hAnsi="Times New Roman" w:cs="Times New Roman"/>
-          <w:sz w:val="19"/>
-          <w:szCs w:val="19"/>
-        </w:rPr>
-        <w:t xml:space="preserve">Signature du Billet à ordre. </w:t>
+          <w:rFonts w:hint="default" w:ascii="Times New Roman" w:hAnsi="Times New Roman" w:eastAsia="Times New Roman" w:cs="Times New Roman"/>
+          <w:sz w:val="24"/>
+          <w:szCs w:val="24"/>
+          <w:lang w:eastAsia="fr-FR"/>
+        </w:rPr>
+      </w:pPr>
+      <w:r>
+        <w:rPr>
+          <w:rFonts w:hint="default" w:ascii="Times New Roman" w:hAnsi="Times New Roman" w:cs="Times New Roman"/>
+          <w:sz w:val="24"/>
+          <w:szCs w:val="24"/>
+        </w:rPr>
+        <w:t>${/guaranteeList}</w:t>
       </w:r>
     </w:p>
     <w:p>
@@ -1230,6 +1464,7 @@
       <w:pPr>
         <w:rPr>
           <w:rFonts w:hint="default" w:ascii="Times New Roman" w:hAnsi="Times New Roman" w:cs="Times New Roman"/>
+          <w:b/>
           <w:sz w:val="20"/>
           <w:szCs w:val="20"/>
         </w:rPr>
@@ -1394,21 +1629,11 @@
         <w:t xml:space="preserve">                                                                       </w:t>
       </w:r>
     </w:p>
-    <w:p>
-      <w:pPr>
-        <w:rPr>
-          <w:rFonts w:hint="default" w:ascii="Times New Roman" w:hAnsi="Times New Roman" w:cs="Times New Roman"/>
-          <w:b/>
-          <w:sz w:val="20"/>
-          <w:szCs w:val="20"/>
-        </w:rPr>
-      </w:pPr>
-    </w:p>
     <w:tbl>
       <w:tblPr>
         <w:tblStyle w:val="3"/>
-        <w:tblpPr w:leftFromText="141" w:rightFromText="141" w:vertAnchor="text" w:horzAnchor="margin" w:tblpX="-289" w:tblpY="260"/>
-        <w:tblW w:w="9787" w:type="dxa"/>
+        <w:tblpPr w:leftFromText="141" w:rightFromText="141" w:vertAnchor="text" w:horzAnchor="page" w:tblpX="647" w:tblpY="124"/>
+        <w:tblW w:w="11027" w:type="dxa"/>
         <w:tblInd w:w="0" w:type="dxa"/>
         <w:tblBorders>
           <w:top w:val="single" w:color="auto" w:sz="4" w:space="0"/>
@@ -1418,7 +1643,7 @@
           <w:insideH w:val="single" w:color="auto" w:sz="4" w:space="0"/>
           <w:insideV w:val="single" w:color="auto" w:sz="4" w:space="0"/>
         </w:tblBorders>
-        <w:tblLayout w:type="autofit"/>
+        <w:tblLayout w:type="fixed"/>
         <w:tblCellMar>
           <w:top w:w="0" w:type="dxa"/>
           <w:left w:w="108" w:type="dxa"/>
@@ -1427,8 +1652,8 @@
         </w:tblCellMar>
       </w:tblPr>
       <w:tblGrid>
-        <w:gridCol w:w="7266"/>
-        <w:gridCol w:w="6016"/>
+        <w:gridCol w:w="6404"/>
+        <w:gridCol w:w="4623"/>
       </w:tblGrid>
       <w:tr>
         <w:tblPrEx>
@@ -1452,7 +1677,7 @@
         </w:trPr>
         <w:tc>
           <w:tcPr>
-            <w:tcW w:w="5374" w:type="dxa"/>
+            <w:tcW w:w="6404" w:type="dxa"/>
             <w:shd w:val="clear" w:color="auto" w:fill="auto"/>
           </w:tcPr>
           <w:p>
@@ -1530,7 +1755,7 @@
         </w:tc>
         <w:tc>
           <w:tcPr>
-            <w:tcW w:w="4413" w:type="dxa"/>
+            <w:tcW w:w="4623" w:type="dxa"/>
             <w:shd w:val="clear" w:color="auto" w:fill="auto"/>
           </w:tcPr>
           <w:p>
@@ -1689,7 +1914,7 @@
         </w:tblPrEx>
         <w:tc>
           <w:tcPr>
-            <w:tcW w:w="5374" w:type="dxa"/>
+            <w:tcW w:w="6404" w:type="dxa"/>
             <w:shd w:val="clear" w:color="auto" w:fill="auto"/>
           </w:tcPr>
           <w:p>
@@ -1779,7 +2004,7 @@
         </w:tc>
         <w:tc>
           <w:tcPr>
-            <w:tcW w:w="4413" w:type="dxa"/>
+            <w:tcW w:w="4623" w:type="dxa"/>
             <w:shd w:val="clear" w:color="auto" w:fill="auto"/>
           </w:tcPr>
           <w:p>
@@ -1939,6 +2164,21 @@
         <w:jc w:val="both"/>
         <w:rPr>
           <w:rFonts w:hint="default" w:ascii="Times New Roman" w:hAnsi="Times New Roman" w:cs="Times New Roman"/>
+          <w:b/>
+          <w:i/>
+          <w:iCs/>
+          <w:sz w:val="20"/>
+          <w:szCs w:val="20"/>
+          <w:u w:val="single"/>
+        </w:rPr>
+      </w:pPr>
+    </w:p>
+    <w:p>
+      <w:pPr>
+        <w:spacing w:after="0" w:line="240" w:lineRule="auto"/>
+        <w:jc w:val="both"/>
+        <w:rPr>
+          <w:rFonts w:hint="default" w:ascii="Times New Roman" w:hAnsi="Times New Roman" w:cs="Times New Roman"/>
           <w:i/>
           <w:iCs/>
           <w:sz w:val="20"/>
@@ -2049,6 +2289,7 @@
     </w:p>
     <w:sectPr>
       <w:headerReference r:id="rId5" w:type="default"/>
+      <w:footerReference r:id="rId6" w:type="default"/>
       <w:pgSz w:w="11906" w:h="16838"/>
       <w:pgMar w:top="993" w:right="1274" w:bottom="993" w:left="1417" w:header="227" w:footer="340" w:gutter="0"/>
       <w:cols w:space="708" w:num="1"/>
@@ -2083,6 +2324,16 @@
 </w:endnotes>
 </file>
 
+<file path=word/footer1.xml><?xml version="1.0" encoding="utf-8"?>
+<w:ftr xmlns:wpc="http://schemas.microsoft.com/office/word/2010/wordprocessingCanvas" xmlns:mc="http://schemas.openxmlformats.org/markup-compatibility/2006" xmlns:o="urn:schemas-microsoft-com:office:office" xmlns:r="http://schemas.openxmlformats.org/officeDocument/2006/relationships" xmlns:m="http://schemas.openxmlformats.org/officeDocument/2006/math" xmlns:v="urn:schemas-microsoft-com:vml" xmlns:wp14="http://schemas.microsoft.com/office/word/2010/wordprocessingDrawing" xmlns:wp="http://schemas.openxmlformats.org/drawingml/2006/wordprocessingDrawing" xmlns:w10="urn:schemas-microsoft-com:office:word" xmlns:w="http://schemas.openxmlformats.org/wordprocessingml/2006/main" xmlns:w14="http://schemas.microsoft.com/office/word/2010/wordml" xmlns:w15="http://schemas.microsoft.com/office/word/2012/wordml" xmlns:wpg="http://schemas.microsoft.com/office/word/2010/wordprocessingGroup" xmlns:wpi="http://schemas.microsoft.com/office/word/2010/wordprocessingInk" xmlns:wne="http://schemas.microsoft.com/office/word/2006/wordml" xmlns:wps="http://schemas.microsoft.com/office/word/2010/wordprocessingShape" xmlns:wpsCustomData="http://www.wps.cn/officeDocument/2013/wpsCustomData" mc:Ignorable="w14 w15 wp14">
+  <w:p>
+    <w:pPr>
+      <w:pStyle w:val="4"/>
+    </w:pPr>
+  </w:p>
+</w:ftr>
+</file>
+
 <file path=word/footnotes.xml><?xml version="1.0" encoding="utf-8"?>
 <w:footnotes xmlns:wpc="http://schemas.microsoft.com/office/word/2010/wordprocessingCanvas" xmlns:mc="http://schemas.openxmlformats.org/markup-compatibility/2006" xmlns:o="urn:schemas-microsoft-com:office:office" xmlns:r="http://schemas.openxmlformats.org/officeDocument/2006/relationships" xmlns:m="http://schemas.openxmlformats.org/officeDocument/2006/math" xmlns:v="urn:schemas-microsoft-com:vml" xmlns:wp14="http://schemas.microsoft.com/office/word/2010/wordprocessingDrawing" xmlns:wp="http://schemas.openxmlformats.org/drawingml/2006/wordprocessingDrawing" xmlns:w="http://schemas.openxmlformats.org/wordprocessingml/2006/main" xmlns:w14="http://schemas.microsoft.com/office/word/2010/wordml" xmlns:w15="http://schemas.microsoft.com/office/word/2012/wordml" xmlns:w10="urn:schemas-microsoft-com:office:word" xmlns:wpg="http://schemas.microsoft.com/office/word/2010/wordprocessingGroup" xmlns:wpi="http://schemas.microsoft.com/office/word/2010/wordprocessingInk" xmlns:wne="http://schemas.microsoft.com/office/word/2006/wordml" xmlns:wps="http://schemas.microsoft.com/office/word/2010/wordprocessingShape" xmlns:wpsCustomData="http://www.wps.cn/officeDocument/2013/wpsCustomData" mc:Ignorable="w14 w15 wp14">
   <w:footnote w:type="separator" w:id="0">
@@ -2116,9 +2367,46 @@
       <w:tabs>
         <w:tab w:val="left" w:pos="2554"/>
       </w:tabs>
+      <w:jc w:val="center"/>
     </w:pPr>
     <w:r>
-      <w:tab/>
+      <w:drawing>
+        <wp:inline distT="0" distB="0" distL="0" distR="0">
+          <wp:extent cx="2753360" cy="752475"/>
+          <wp:effectExtent l="0" t="0" r="8890" b="9525"/>
+          <wp:docPr id="2" name="Image 2"/>
+          <wp:cNvGraphicFramePr>
+            <a:graphicFrameLocks xmlns:a="http://schemas.openxmlformats.org/drawingml/2006/main" noChangeAspect="1"/>
+          </wp:cNvGraphicFramePr>
+          <a:graphic xmlns:a="http://schemas.openxmlformats.org/drawingml/2006/main">
+            <a:graphicData uri="http://schemas.openxmlformats.org/drawingml/2006/picture">
+              <pic:pic xmlns:pic="http://schemas.openxmlformats.org/drawingml/2006/picture">
+                <pic:nvPicPr>
+                  <pic:cNvPr id="2" name="Image 2"/>
+                  <pic:cNvPicPr>
+                    <a:picLocks noChangeAspect="1" noChangeArrowheads="1"/>
+                  </pic:cNvPicPr>
+                </pic:nvPicPr>
+                <pic:blipFill>
+                  <a:blip r:embed="rId1"/>
+                  <a:stretch>
+                    <a:fillRect/>
+                  </a:stretch>
+                </pic:blipFill>
+                <pic:spPr>
+                  <a:xfrm>
+                    <a:off x="0" y="0"/>
+                    <a:ext cx="2753360" cy="752475"/>
+                  </a:xfrm>
+                  <a:prstGeom prst="rect">
+                    <a:avLst/>
+                  </a:prstGeom>
+                </pic:spPr>
+              </pic:pic>
+            </a:graphicData>
+          </a:graphic>
+        </wp:inline>
+      </w:drawing>
     </w:r>
   </w:p>
   <w:p>
@@ -2129,12 +2417,152 @@
       </w:tabs>
     </w:pPr>
   </w:p>
+  <w:p>
+    <w:pPr>
+      <w:pStyle w:val="5"/>
+      <w:tabs>
+        <w:tab w:val="left" w:pos="2554"/>
+      </w:tabs>
+    </w:pPr>
+  </w:p>
+  <w:p>
+    <w:pPr>
+      <w:pStyle w:val="5"/>
+      <w:tabs>
+        <w:tab w:val="left" w:pos="2554"/>
+      </w:tabs>
+      <w:rPr>
+        <w:rFonts w:hint="default"/>
+        <w:lang w:val="en-US"/>
+      </w:rPr>
+    </w:pPr>
+    <w:r>
+      <w:rPr>
+        <w:rFonts w:hint="default"/>
+        <w:lang w:val="en-US"/>
+      </w:rPr>
+      <w:t>N°${verbal_trial.committee_id}</w:t>
+    </w:r>
+  </w:p>
 </w:hdr>
 </file>
 
 <file path=word/numbering.xml><?xml version="1.0" encoding="utf-8"?>
 <w:numbering xmlns:wpc="http://schemas.microsoft.com/office/word/2010/wordprocessingCanvas" xmlns:mc="http://schemas.openxmlformats.org/markup-compatibility/2006" xmlns:o="urn:schemas-microsoft-com:office:office" xmlns:r="http://schemas.openxmlformats.org/officeDocument/2006/relationships" xmlns:m="http://schemas.openxmlformats.org/officeDocument/2006/math" xmlns:v="urn:schemas-microsoft-com:vml" xmlns:wp14="http://schemas.microsoft.com/office/word/2010/wordprocessingDrawing" xmlns:wp="http://schemas.openxmlformats.org/drawingml/2006/wordprocessingDrawing" xmlns:w10="urn:schemas-microsoft-com:office:word" xmlns:w="http://schemas.openxmlformats.org/wordprocessingml/2006/main" xmlns:w14="http://schemas.microsoft.com/office/word/2010/wordml" xmlns:wpg="http://schemas.microsoft.com/office/word/2010/wordprocessingGroup" xmlns:wpi="http://schemas.microsoft.com/office/word/2010/wordprocessingInk" xmlns:wne="http://schemas.microsoft.com/office/word/2006/wordml" xmlns:wps="http://schemas.microsoft.com/office/word/2010/wordprocessingShape" xmlns:wpsCustomData="http://www.wps.cn/officeDocument/2013/wpsCustomData" mc:Ignorable="w14 wp14">
   <w:abstractNum w:abstractNumId="0">
+    <w:nsid w:val="CDEAFEFF"/>
+    <w:multiLevelType w:val="multilevel"/>
+    <w:tmpl w:val="CDEAFEFF"/>
+    <w:lvl w:ilvl="0" w:tentative="0">
+      <w:start w:val="1"/>
+      <w:numFmt w:val="decimal"/>
+      <w:lvlText w:val="%1."/>
+      <w:lvlJc w:val="left"/>
+      <w:pPr>
+        <w:tabs>
+          <w:tab w:val="left" w:pos="720"/>
+        </w:tabs>
+        <w:ind w:left="720" w:hanging="360"/>
+      </w:pPr>
+    </w:lvl>
+    <w:lvl w:ilvl="1" w:tentative="0">
+      <w:start w:val="1"/>
+      <w:numFmt w:val="decimal"/>
+      <w:lvlText w:val="%2."/>
+      <w:lvlJc w:val="left"/>
+      <w:pPr>
+        <w:tabs>
+          <w:tab w:val="left" w:pos="1080"/>
+        </w:tabs>
+        <w:ind w:left="1080" w:hanging="360"/>
+      </w:pPr>
+    </w:lvl>
+    <w:lvl w:ilvl="2" w:tentative="0">
+      <w:start w:val="1"/>
+      <w:numFmt w:val="decimal"/>
+      <w:lvlText w:val="%3."/>
+      <w:lvlJc w:val="left"/>
+      <w:pPr>
+        <w:tabs>
+          <w:tab w:val="left" w:pos="1440"/>
+        </w:tabs>
+        <w:ind w:left="1440" w:hanging="360"/>
+      </w:pPr>
+    </w:lvl>
+    <w:lvl w:ilvl="3" w:tentative="0">
+      <w:start w:val="1"/>
+      <w:numFmt w:val="decimal"/>
+      <w:lvlText w:val="%4."/>
+      <w:lvlJc w:val="left"/>
+      <w:pPr>
+        <w:tabs>
+          <w:tab w:val="left" w:pos="1800"/>
+        </w:tabs>
+        <w:ind w:left="1800" w:hanging="360"/>
+      </w:pPr>
+    </w:lvl>
+    <w:lvl w:ilvl="4" w:tentative="0">
+      <w:start w:val="1"/>
+      <w:numFmt w:val="decimal"/>
+      <w:lvlText w:val="%5."/>
+      <w:lvlJc w:val="left"/>
+      <w:pPr>
+        <w:tabs>
+          <w:tab w:val="left" w:pos="2160"/>
+        </w:tabs>
+        <w:ind w:left="2160" w:hanging="360"/>
+      </w:pPr>
+    </w:lvl>
+    <w:lvl w:ilvl="5" w:tentative="0">
+      <w:start w:val="1"/>
+      <w:numFmt w:val="decimal"/>
+      <w:lvlText w:val="%6."/>
+      <w:lvlJc w:val="left"/>
+      <w:pPr>
+        <w:tabs>
+          <w:tab w:val="left" w:pos="2520"/>
+        </w:tabs>
+        <w:ind w:left="2520" w:hanging="360"/>
+      </w:pPr>
+    </w:lvl>
+    <w:lvl w:ilvl="6" w:tentative="0">
+      <w:start w:val="1"/>
+      <w:numFmt w:val="decimal"/>
+      <w:lvlText w:val="%7."/>
+      <w:lvlJc w:val="left"/>
+      <w:pPr>
+        <w:tabs>
+          <w:tab w:val="left" w:pos="2880"/>
+        </w:tabs>
+        <w:ind w:left="2880" w:hanging="360"/>
+      </w:pPr>
+    </w:lvl>
+    <w:lvl w:ilvl="7" w:tentative="0">
+      <w:start w:val="1"/>
+      <w:numFmt w:val="decimal"/>
+      <w:lvlText w:val="%8."/>
+      <w:lvlJc w:val="left"/>
+      <w:pPr>
+        <w:tabs>
+          <w:tab w:val="left" w:pos="3240"/>
+        </w:tabs>
+        <w:ind w:left="3240" w:hanging="360"/>
+      </w:pPr>
+    </w:lvl>
+    <w:lvl w:ilvl="8" w:tentative="0">
+      <w:start w:val="1"/>
+      <w:numFmt w:val="decimal"/>
+      <w:lvlText w:val="%9."/>
+      <w:lvlJc w:val="left"/>
+      <w:pPr>
+        <w:tabs>
+          <w:tab w:val="left" w:pos="3600"/>
+        </w:tabs>
+        <w:ind w:left="3600" w:hanging="360"/>
+      </w:pPr>
+    </w:lvl>
+  </w:abstractNum>
+  <w:abstractNum w:abstractNumId="1">
     <w:nsid w:val="0A8C4050"/>
     <w:multiLevelType w:val="multilevel"/>
     <w:tmpl w:val="0A8C4050"/>
@@ -2223,7 +2651,7 @@
       </w:pPr>
     </w:lvl>
   </w:abstractNum>
-  <w:abstractNum w:abstractNumId="1">
+  <w:abstractNum w:abstractNumId="2">
     <w:nsid w:val="70DC0791"/>
     <w:multiLevelType w:val="multilevel"/>
     <w:tmpl w:val="70DC0791"/>
@@ -2336,104 +2764,14 @@
       </w:rPr>
     </w:lvl>
   </w:abstractNum>
-  <w:abstractNum w:abstractNumId="2">
-    <w:nsid w:val="7A1666AD"/>
-    <w:multiLevelType w:val="multilevel"/>
-    <w:tmpl w:val="7A1666AD"/>
-    <w:lvl w:ilvl="0" w:tentative="0">
-      <w:start w:val="1"/>
-      <w:numFmt w:val="decimal"/>
-      <w:lvlText w:val="%1."/>
-      <w:lvlJc w:val="left"/>
-      <w:pPr>
-        <w:ind w:left="720" w:hanging="360"/>
-      </w:pPr>
-      <w:rPr>
-        <w:b w:val="0"/>
-        <w:bCs w:val="0"/>
-      </w:rPr>
-    </w:lvl>
-    <w:lvl w:ilvl="1" w:tentative="0">
-      <w:start w:val="1"/>
-      <w:numFmt w:val="lowerLetter"/>
-      <w:lvlText w:val="%2."/>
-      <w:lvlJc w:val="left"/>
-      <w:pPr>
-        <w:ind w:left="1440" w:hanging="360"/>
-      </w:pPr>
-    </w:lvl>
-    <w:lvl w:ilvl="2" w:tentative="0">
-      <w:start w:val="1"/>
-      <w:numFmt w:val="lowerRoman"/>
-      <w:lvlText w:val="%3."/>
-      <w:lvlJc w:val="right"/>
-      <w:pPr>
-        <w:ind w:left="2160" w:hanging="180"/>
-      </w:pPr>
-    </w:lvl>
-    <w:lvl w:ilvl="3" w:tentative="0">
-      <w:start w:val="1"/>
-      <w:numFmt w:val="decimal"/>
-      <w:lvlText w:val="%4."/>
-      <w:lvlJc w:val="left"/>
-      <w:pPr>
-        <w:ind w:left="2880" w:hanging="360"/>
-      </w:pPr>
-    </w:lvl>
-    <w:lvl w:ilvl="4" w:tentative="0">
-      <w:start w:val="1"/>
-      <w:numFmt w:val="lowerLetter"/>
-      <w:lvlText w:val="%5."/>
-      <w:lvlJc w:val="left"/>
-      <w:pPr>
-        <w:ind w:left="3600" w:hanging="360"/>
-      </w:pPr>
-    </w:lvl>
-    <w:lvl w:ilvl="5" w:tentative="0">
-      <w:start w:val="1"/>
-      <w:numFmt w:val="lowerRoman"/>
-      <w:lvlText w:val="%6."/>
-      <w:lvlJc w:val="right"/>
-      <w:pPr>
-        <w:ind w:left="4320" w:hanging="180"/>
-      </w:pPr>
-    </w:lvl>
-    <w:lvl w:ilvl="6" w:tentative="0">
-      <w:start w:val="1"/>
-      <w:numFmt w:val="decimal"/>
-      <w:lvlText w:val="%7."/>
-      <w:lvlJc w:val="left"/>
-      <w:pPr>
-        <w:ind w:left="5040" w:hanging="360"/>
-      </w:pPr>
-    </w:lvl>
-    <w:lvl w:ilvl="7" w:tentative="0">
-      <w:start w:val="1"/>
-      <w:numFmt w:val="lowerLetter"/>
-      <w:lvlText w:val="%8."/>
-      <w:lvlJc w:val="left"/>
-      <w:pPr>
-        <w:ind w:left="5760" w:hanging="360"/>
-      </w:pPr>
-    </w:lvl>
-    <w:lvl w:ilvl="8" w:tentative="0">
-      <w:start w:val="1"/>
-      <w:numFmt w:val="lowerRoman"/>
-      <w:lvlText w:val="%9."/>
-      <w:lvlJc w:val="right"/>
-      <w:pPr>
-        <w:ind w:left="6480" w:hanging="180"/>
-      </w:pPr>
-    </w:lvl>
-  </w:abstractNum>
   <w:num w:numId="1">
-    <w:abstractNumId w:val="1"/>
+    <w:abstractNumId w:val="2"/>
   </w:num>
   <w:num w:numId="2">
-    <w:abstractNumId w:val="2"/>
+    <w:abstractNumId w:val="0"/>
   </w:num>
   <w:num w:numId="3">
-    <w:abstractNumId w:val="0"/>
+    <w:abstractNumId w:val="1"/>
   </w:num>
 </w:numbering>
 </file>
@@ -2443,7 +2781,7 @@
   <w:docDefaults>
     <w:rPrDefault>
       <w:rPr>
-        <w:rFonts w:asciiTheme="minorHAnsi" w:hAnsiTheme="minorHAnsi" w:eastAsiaTheme="minorHAnsi" w:cstheme="minorBidi"/>
+        <w:rFonts w:ascii="Times New Roman" w:hAnsi="Times New Roman" w:eastAsia="SimSun" w:cs="Times New Roman"/>
       </w:rPr>
     </w:rPrDefault>
     <w:pPrDefault/>

</xml_diff>